<commit_message>
feat: implement play interface with video detection challenges and updated brand assets
</commit_message>
<xml_diff>
--- a/TruthLens_PRD.docx
+++ b/TruthLens_PRD.docx
@@ -62,12 +62,6 @@
         <w:gridCol w:w="2520"/>
       </w:tblGrid>
       <w:tr>
-        <w:tblPrEx>
-          <w:tblCellMar>
-            <w:top w:w="0" w:type="dxa"/>
-            <w:bottom w:w="0" w:type="dxa"/>
-          </w:tblCellMar>
-        </w:tblPrEx>
         <w:trPr>
           <w:jc w:val="center"/>
         </w:trPr>
@@ -131,12 +125,6 @@
         </w:tc>
       </w:tr>
       <w:tr>
-        <w:tblPrEx>
-          <w:tblCellMar>
-            <w:top w:w="0" w:type="dxa"/>
-            <w:bottom w:w="0" w:type="dxa"/>
-          </w:tblCellMar>
-        </w:tblPrEx>
         <w:trPr>
           <w:jc w:val="center"/>
         </w:trPr>
@@ -200,12 +188,6 @@
         </w:tc>
       </w:tr>
       <w:tr>
-        <w:tblPrEx>
-          <w:tblCellMar>
-            <w:top w:w="0" w:type="dxa"/>
-            <w:bottom w:w="0" w:type="dxa"/>
-          </w:tblCellMar>
-        </w:tblPrEx>
         <w:trPr>
           <w:jc w:val="center"/>
         </w:trPr>
@@ -269,12 +251,6 @@
         </w:tc>
       </w:tr>
       <w:tr>
-        <w:tblPrEx>
-          <w:tblCellMar>
-            <w:top w:w="0" w:type="dxa"/>
-            <w:bottom w:w="0" w:type="dxa"/>
-          </w:tblCellMar>
-        </w:tblPrEx>
         <w:trPr>
           <w:jc w:val="center"/>
         </w:trPr>
@@ -371,13 +347,7 @@
         <w:rPr>
           <w:color w:val="1A1A1A"/>
         </w:rPr>
-        <w:t xml:space="preserve"> is an interactive, gamified web platform that trains users to identify AI-generated (Deepfake) videos from real ones. Inspired by the Duolingo learning model, the platform rewards progress, builds digital literacy skills, and explains the</w:t>
-      </w:r>
-      <w:r>
-        <w:rPr>
-          <w:color w:val="1A1A1A"/>
-        </w:rPr>
-        <w:t xml:space="preserve"> visual cues that expose manipulated media.</w:t>
+        <w:t xml:space="preserve"> is an interactive, gamified web platform that trains users to identify AI-generated (Deepfake) videos from real ones. Inspired by the Duolingo learning model, the platform rewards progress, builds digital literacy skills, and explains the visual cues that expose manipulated media.</w:t>
       </w:r>
     </w:p>
     <w:p>
@@ -406,12 +376,6 @@
         <w:gridCol w:w="9360"/>
       </w:tblGrid>
       <w:tr>
-        <w:tblPrEx>
-          <w:tblCellMar>
-            <w:top w:w="0" w:type="dxa"/>
-            <w:bottom w:w="0" w:type="dxa"/>
-          </w:tblCellMar>
-        </w:tblPrEx>
         <w:tc>
           <w:tcPr>
             <w:tcW w:w="0" w:type="auto"/>
@@ -441,17 +405,7 @@
                 <w:sz w:val="20"/>
                 <w:szCs w:val="20"/>
               </w:rPr>
-              <w:t>🎯</w:t>
-            </w:r>
-            <w:r>
-              <w:rPr>
-                <w:b/>
-                <w:bCs/>
-                <w:color w:val="0F6E56"/>
-                <w:sz w:val="20"/>
-                <w:szCs w:val="20"/>
-              </w:rPr>
-              <w:t xml:space="preserve">  Mission Statement</w:t>
+              <w:t>🎯  Mission Statement</w:t>
             </w:r>
           </w:p>
           <w:p>
@@ -491,13 +445,7 @@
         <w:rPr>
           <w:color w:val="1A1A1A"/>
         </w:rPr>
-        <w:t>By 2026, synthetic media (Deepfakes) will represent a significant portion of online video content. The vast majority of people cannot reliably distinguish between real and AI-generated video, creating vulnerability to misinformation, political manipulation</w:t>
-      </w:r>
-      <w:r>
-        <w:rPr>
-          <w:color w:val="1A1A1A"/>
-        </w:rPr>
-        <w:t>, and fraud.</w:t>
+        <w:t>By 2026, synthetic media (Deepfakes) will represent a significant portion of online video content. The vast majority of people cannot reliably distinguish between real and AI-generated video, creating vulnerability to misinformation, political manipulation, and fraud.</w:t>
       </w:r>
     </w:p>
     <w:p>
@@ -604,13 +552,7 @@
         <w:rPr>
           <w:color w:val="1A1A1A"/>
         </w:rPr>
-        <w:t>Dashboard track</w:t>
-      </w:r>
-      <w:r>
-        <w:rPr>
-          <w:color w:val="1A1A1A"/>
-        </w:rPr>
-        <w:t>s progress and skill score over time</w:t>
+        <w:t>Dashboard tracks progress and skill score over time</w:t>
       </w:r>
     </w:p>
     <w:p>
@@ -657,12 +599,6 @@
         <w:gridCol w:w="3680"/>
       </w:tblGrid>
       <w:tr>
-        <w:tblPrEx>
-          <w:tblCellMar>
-            <w:top w:w="0" w:type="dxa"/>
-            <w:bottom w:w="0" w:type="dxa"/>
-          </w:tblCellMar>
-        </w:tblPrEx>
         <w:tc>
           <w:tcPr>
             <w:tcW w:w="2000" w:type="dxa"/>
@@ -764,12 +700,6 @@
         </w:tc>
       </w:tr>
       <w:tr>
-        <w:tblPrEx>
-          <w:tblCellMar>
-            <w:top w:w="0" w:type="dxa"/>
-            <w:bottom w:w="0" w:type="dxa"/>
-          </w:tblCellMar>
-        </w:tblPrEx>
         <w:tc>
           <w:tcPr>
             <w:tcW w:w="2000" w:type="dxa"/>
@@ -870,12 +800,6 @@
         </w:tc>
       </w:tr>
       <w:tr>
-        <w:tblPrEx>
-          <w:tblCellMar>
-            <w:top w:w="0" w:type="dxa"/>
-            <w:bottom w:w="0" w:type="dxa"/>
-          </w:tblCellMar>
-        </w:tblPrEx>
         <w:tc>
           <w:tcPr>
             <w:tcW w:w="2000" w:type="dxa"/>
@@ -964,12 +888,6 @@
         </w:tc>
       </w:tr>
       <w:tr>
-        <w:tblPrEx>
-          <w:tblCellMar>
-            <w:top w:w="0" w:type="dxa"/>
-            <w:bottom w:w="0" w:type="dxa"/>
-          </w:tblCellMar>
-        </w:tblPrEx>
         <w:tc>
           <w:tcPr>
             <w:tcW w:w="2000" w:type="dxa"/>
@@ -1199,13 +1117,7 @@
         <w:rPr>
           <w:color w:val="1A1A1A"/>
         </w:rPr>
-        <w:t>Arabi</w:t>
-      </w:r>
-      <w:r>
-        <w:rPr>
-          <w:color w:val="1A1A1A"/>
-        </w:rPr>
-        <w:t>c + English UI support</w:t>
+        <w:t>Arabic + English UI support</w:t>
       </w:r>
     </w:p>
     <w:p>
@@ -1359,12 +1271,6 @@
         <w:gridCol w:w="4280"/>
       </w:tblGrid>
       <w:tr>
-        <w:tblPrEx>
-          <w:tblCellMar>
-            <w:top w:w="0" w:type="dxa"/>
-            <w:bottom w:w="0" w:type="dxa"/>
-          </w:tblCellMar>
-        </w:tblPrEx>
         <w:tc>
           <w:tcPr>
             <w:tcW w:w="800" w:type="dxa"/>
@@ -1466,12 +1372,6 @@
         </w:tc>
       </w:tr>
       <w:tr>
-        <w:tblPrEx>
-          <w:tblCellMar>
-            <w:top w:w="0" w:type="dxa"/>
-            <w:bottom w:w="0" w:type="dxa"/>
-          </w:tblCellMar>
-        </w:tblPrEx>
         <w:tc>
           <w:tcPr>
             <w:tcW w:w="800" w:type="dxa"/>
@@ -1563,12 +1463,6 @@
         </w:tc>
       </w:tr>
       <w:tr>
-        <w:tblPrEx>
-          <w:tblCellMar>
-            <w:top w:w="0" w:type="dxa"/>
-            <w:bottom w:w="0" w:type="dxa"/>
-          </w:tblCellMar>
-        </w:tblPrEx>
         <w:tc>
           <w:tcPr>
             <w:tcW w:w="800" w:type="dxa"/>
@@ -1660,12 +1554,6 @@
         </w:tc>
       </w:tr>
       <w:tr>
-        <w:tblPrEx>
-          <w:tblCellMar>
-            <w:top w:w="0" w:type="dxa"/>
-            <w:bottom w:w="0" w:type="dxa"/>
-          </w:tblCellMar>
-        </w:tblPrEx>
         <w:tc>
           <w:tcPr>
             <w:tcW w:w="800" w:type="dxa"/>
@@ -1802,12 +1690,6 @@
         <w:gridCol w:w="4280"/>
       </w:tblGrid>
       <w:tr>
-        <w:tblPrEx>
-          <w:tblCellMar>
-            <w:top w:w="0" w:type="dxa"/>
-            <w:bottom w:w="0" w:type="dxa"/>
-          </w:tblCellMar>
-        </w:tblPrEx>
         <w:tc>
           <w:tcPr>
             <w:tcW w:w="800" w:type="dxa"/>
@@ -1909,12 +1791,6 @@
         </w:tc>
       </w:tr>
       <w:tr>
-        <w:tblPrEx>
-          <w:tblCellMar>
-            <w:top w:w="0" w:type="dxa"/>
-            <w:bottom w:w="0" w:type="dxa"/>
-          </w:tblCellMar>
-        </w:tblPrEx>
         <w:tc>
           <w:tcPr>
             <w:tcW w:w="800" w:type="dxa"/>
@@ -2006,12 +1882,6 @@
         </w:tc>
       </w:tr>
       <w:tr>
-        <w:tblPrEx>
-          <w:tblCellMar>
-            <w:top w:w="0" w:type="dxa"/>
-            <w:bottom w:w="0" w:type="dxa"/>
-          </w:tblCellMar>
-        </w:tblPrEx>
         <w:tc>
           <w:tcPr>
             <w:tcW w:w="800" w:type="dxa"/>
@@ -2103,12 +1973,6 @@
         </w:tc>
       </w:tr>
       <w:tr>
-        <w:tblPrEx>
-          <w:tblCellMar>
-            <w:top w:w="0" w:type="dxa"/>
-            <w:bottom w:w="0" w:type="dxa"/>
-          </w:tblCellMar>
-        </w:tblPrEx>
         <w:tc>
           <w:tcPr>
             <w:tcW w:w="800" w:type="dxa"/>
@@ -2200,12 +2064,6 @@
         </w:tc>
       </w:tr>
       <w:tr>
-        <w:tblPrEx>
-          <w:tblCellMar>
-            <w:top w:w="0" w:type="dxa"/>
-            <w:bottom w:w="0" w:type="dxa"/>
-          </w:tblCellMar>
-        </w:tblPrEx>
         <w:tc>
           <w:tcPr>
             <w:tcW w:w="800" w:type="dxa"/>
@@ -2297,12 +2155,6 @@
         </w:tc>
       </w:tr>
       <w:tr>
-        <w:tblPrEx>
-          <w:tblCellMar>
-            <w:top w:w="0" w:type="dxa"/>
-            <w:bottom w:w="0" w:type="dxa"/>
-          </w:tblCellMar>
-        </w:tblPrEx>
         <w:tc>
           <w:tcPr>
             <w:tcW w:w="800" w:type="dxa"/>
@@ -2433,12 +2285,6 @@
         <w:gridCol w:w="4280"/>
       </w:tblGrid>
       <w:tr>
-        <w:tblPrEx>
-          <w:tblCellMar>
-            <w:top w:w="0" w:type="dxa"/>
-            <w:bottom w:w="0" w:type="dxa"/>
-          </w:tblCellMar>
-        </w:tblPrEx>
         <w:tc>
           <w:tcPr>
             <w:tcW w:w="800" w:type="dxa"/>
@@ -2540,12 +2386,6 @@
         </w:tc>
       </w:tr>
       <w:tr>
-        <w:tblPrEx>
-          <w:tblCellMar>
-            <w:top w:w="0" w:type="dxa"/>
-            <w:bottom w:w="0" w:type="dxa"/>
-          </w:tblCellMar>
-        </w:tblPrEx>
         <w:tc>
           <w:tcPr>
             <w:tcW w:w="800" w:type="dxa"/>
@@ -2637,12 +2477,6 @@
         </w:tc>
       </w:tr>
       <w:tr>
-        <w:tblPrEx>
-          <w:tblCellMar>
-            <w:top w:w="0" w:type="dxa"/>
-            <w:bottom w:w="0" w:type="dxa"/>
-          </w:tblCellMar>
-        </w:tblPrEx>
         <w:tc>
           <w:tcPr>
             <w:tcW w:w="800" w:type="dxa"/>
@@ -2734,12 +2568,6 @@
         </w:tc>
       </w:tr>
       <w:tr>
-        <w:tblPrEx>
-          <w:tblCellMar>
-            <w:top w:w="0" w:type="dxa"/>
-            <w:bottom w:w="0" w:type="dxa"/>
-          </w:tblCellMar>
-        </w:tblPrEx>
         <w:tc>
           <w:tcPr>
             <w:tcW w:w="800" w:type="dxa"/>
@@ -2870,12 +2698,6 @@
         <w:gridCol w:w="4280"/>
       </w:tblGrid>
       <w:tr>
-        <w:tblPrEx>
-          <w:tblCellMar>
-            <w:top w:w="0" w:type="dxa"/>
-            <w:bottom w:w="0" w:type="dxa"/>
-          </w:tblCellMar>
-        </w:tblPrEx>
         <w:tc>
           <w:tcPr>
             <w:tcW w:w="800" w:type="dxa"/>
@@ -2977,12 +2799,6 @@
         </w:tc>
       </w:tr>
       <w:tr>
-        <w:tblPrEx>
-          <w:tblCellMar>
-            <w:top w:w="0" w:type="dxa"/>
-            <w:bottom w:w="0" w:type="dxa"/>
-          </w:tblCellMar>
-        </w:tblPrEx>
         <w:tc>
           <w:tcPr>
             <w:tcW w:w="800" w:type="dxa"/>
@@ -3074,12 +2890,6 @@
         </w:tc>
       </w:tr>
       <w:tr>
-        <w:tblPrEx>
-          <w:tblCellMar>
-            <w:top w:w="0" w:type="dxa"/>
-            <w:bottom w:w="0" w:type="dxa"/>
-          </w:tblCellMar>
-        </w:tblPrEx>
         <w:tc>
           <w:tcPr>
             <w:tcW w:w="800" w:type="dxa"/>
@@ -3276,13 +3086,7 @@
         <w:rPr>
           <w:color w:val="1A1A1A"/>
         </w:rPr>
-        <w:t>Source</w:t>
-      </w:r>
-      <w:r>
-        <w:rPr>
-          <w:color w:val="1A1A1A"/>
-        </w:rPr>
-        <w:t xml:space="preserve">: </w:t>
+        <w:t xml:space="preserve">Source: </w:t>
       </w:r>
       <w:proofErr w:type="spellStart"/>
       <w:r>
@@ -3445,12 +3249,6 @@
         <w:gridCol w:w="3120"/>
       </w:tblGrid>
       <w:tr>
-        <w:tblPrEx>
-          <w:tblCellMar>
-            <w:top w:w="0" w:type="dxa"/>
-            <w:bottom w:w="0" w:type="dxa"/>
-          </w:tblCellMar>
-        </w:tblPrEx>
         <w:tc>
           <w:tcPr>
             <w:tcW w:w="3120" w:type="dxa"/>
@@ -3552,12 +3350,6 @@
         </w:tc>
       </w:tr>
       <w:tr>
-        <w:tblPrEx>
-          <w:tblCellMar>
-            <w:top w:w="0" w:type="dxa"/>
-            <w:bottom w:w="0" w:type="dxa"/>
-          </w:tblCellMar>
-        </w:tblPrEx>
         <w:tc>
           <w:tcPr>
             <w:tcW w:w="3120" w:type="dxa"/>
@@ -3649,12 +3441,6 @@
         </w:tc>
       </w:tr>
       <w:tr>
-        <w:tblPrEx>
-          <w:tblCellMar>
-            <w:top w:w="0" w:type="dxa"/>
-            <w:bottom w:w="0" w:type="dxa"/>
-          </w:tblCellMar>
-        </w:tblPrEx>
         <w:tc>
           <w:tcPr>
             <w:tcW w:w="3120" w:type="dxa"/>
@@ -3746,12 +3532,6 @@
         </w:tc>
       </w:tr>
       <w:tr>
-        <w:tblPrEx>
-          <w:tblCellMar>
-            <w:top w:w="0" w:type="dxa"/>
-            <w:bottom w:w="0" w:type="dxa"/>
-          </w:tblCellMar>
-        </w:tblPrEx>
         <w:tc>
           <w:tcPr>
             <w:tcW w:w="3120" w:type="dxa"/>
@@ -3843,12 +3623,6 @@
         </w:tc>
       </w:tr>
       <w:tr>
-        <w:tblPrEx>
-          <w:tblCellMar>
-            <w:top w:w="0" w:type="dxa"/>
-            <w:bottom w:w="0" w:type="dxa"/>
-          </w:tblCellMar>
-        </w:tblPrEx>
         <w:tc>
           <w:tcPr>
             <w:tcW w:w="3120" w:type="dxa"/>
@@ -3940,12 +3714,6 @@
         </w:tc>
       </w:tr>
       <w:tr>
-        <w:tblPrEx>
-          <w:tblCellMar>
-            <w:top w:w="0" w:type="dxa"/>
-            <w:bottom w:w="0" w:type="dxa"/>
-          </w:tblCellMar>
-        </w:tblPrEx>
         <w:tc>
           <w:tcPr>
             <w:tcW w:w="3120" w:type="dxa"/>
@@ -4077,12 +3845,6 @@
         <w:gridCol w:w="2600"/>
       </w:tblGrid>
       <w:tr>
-        <w:tblPrEx>
-          <w:tblCellMar>
-            <w:top w:w="0" w:type="dxa"/>
-            <w:bottom w:w="0" w:type="dxa"/>
-          </w:tblCellMar>
-        </w:tblPrEx>
         <w:tc>
           <w:tcPr>
             <w:tcW w:w="1560" w:type="dxa"/>
@@ -4217,12 +3979,6 @@
         </w:tc>
       </w:tr>
       <w:tr>
-        <w:tblPrEx>
-          <w:tblCellMar>
-            <w:top w:w="0" w:type="dxa"/>
-            <w:bottom w:w="0" w:type="dxa"/>
-          </w:tblCellMar>
-        </w:tblPrEx>
         <w:tc>
           <w:tcPr>
             <w:tcW w:w="1560" w:type="dxa"/>
@@ -4343,12 +4099,6 @@
         </w:tc>
       </w:tr>
       <w:tr>
-        <w:tblPrEx>
-          <w:tblCellMar>
-            <w:top w:w="0" w:type="dxa"/>
-            <w:bottom w:w="0" w:type="dxa"/>
-          </w:tblCellMar>
-        </w:tblPrEx>
         <w:tc>
           <w:tcPr>
             <w:tcW w:w="1560" w:type="dxa"/>
@@ -4469,12 +4219,6 @@
         </w:tc>
       </w:tr>
       <w:tr>
-        <w:tblPrEx>
-          <w:tblCellMar>
-            <w:top w:w="0" w:type="dxa"/>
-            <w:bottom w:w="0" w:type="dxa"/>
-          </w:tblCellMar>
-        </w:tblPrEx>
         <w:tc>
           <w:tcPr>
             <w:tcW w:w="1560" w:type="dxa"/>
@@ -4595,12 +4339,6 @@
         </w:tc>
       </w:tr>
       <w:tr>
-        <w:tblPrEx>
-          <w:tblCellMar>
-            <w:top w:w="0" w:type="dxa"/>
-            <w:bottom w:w="0" w:type="dxa"/>
-          </w:tblCellMar>
-        </w:tblPrEx>
         <w:tc>
           <w:tcPr>
             <w:tcW w:w="1560" w:type="dxa"/>
@@ -4722,12 +4460,6 @@
         </w:tc>
       </w:tr>
       <w:tr>
-        <w:tblPrEx>
-          <w:tblCellMar>
-            <w:top w:w="0" w:type="dxa"/>
-            <w:bottom w:w="0" w:type="dxa"/>
-          </w:tblCellMar>
-        </w:tblPrEx>
         <w:tc>
           <w:tcPr>
             <w:tcW w:w="1560" w:type="dxa"/>
@@ -4892,12 +4624,6 @@
         <w:gridCol w:w="3510"/>
       </w:tblGrid>
       <w:tr>
-        <w:tblPrEx>
-          <w:tblCellMar>
-            <w:top w:w="0" w:type="dxa"/>
-            <w:bottom w:w="0" w:type="dxa"/>
-          </w:tblCellMar>
-        </w:tblPrEx>
         <w:tc>
           <w:tcPr>
             <w:tcW w:w="2340" w:type="dxa"/>
@@ -4999,12 +4725,6 @@
         </w:tc>
       </w:tr>
       <w:tr>
-        <w:tblPrEx>
-          <w:tblCellMar>
-            <w:top w:w="0" w:type="dxa"/>
-            <w:bottom w:w="0" w:type="dxa"/>
-          </w:tblCellMar>
-        </w:tblPrEx>
         <w:tc>
           <w:tcPr>
             <w:tcW w:w="2340" w:type="dxa"/>
@@ -5093,12 +4813,6 @@
         </w:tc>
       </w:tr>
       <w:tr>
-        <w:tblPrEx>
-          <w:tblCellMar>
-            <w:top w:w="0" w:type="dxa"/>
-            <w:bottom w:w="0" w:type="dxa"/>
-          </w:tblCellMar>
-        </w:tblPrEx>
         <w:tc>
           <w:tcPr>
             <w:tcW w:w="2340" w:type="dxa"/>
@@ -5187,12 +4901,6 @@
         </w:tc>
       </w:tr>
       <w:tr>
-        <w:tblPrEx>
-          <w:tblCellMar>
-            <w:top w:w="0" w:type="dxa"/>
-            <w:bottom w:w="0" w:type="dxa"/>
-          </w:tblCellMar>
-        </w:tblPrEx>
         <w:tc>
           <w:tcPr>
             <w:tcW w:w="2340" w:type="dxa"/>
@@ -5281,12 +4989,6 @@
         </w:tc>
       </w:tr>
       <w:tr>
-        <w:tblPrEx>
-          <w:tblCellMar>
-            <w:top w:w="0" w:type="dxa"/>
-            <w:bottom w:w="0" w:type="dxa"/>
-          </w:tblCellMar>
-        </w:tblPrEx>
         <w:tc>
           <w:tcPr>
             <w:tcW w:w="2340" w:type="dxa"/>
@@ -5375,12 +5077,6 @@
         </w:tc>
       </w:tr>
       <w:tr>
-        <w:tblPrEx>
-          <w:tblCellMar>
-            <w:top w:w="0" w:type="dxa"/>
-            <w:bottom w:w="0" w:type="dxa"/>
-          </w:tblCellMar>
-        </w:tblPrEx>
         <w:tc>
           <w:tcPr>
             <w:tcW w:w="2340" w:type="dxa"/>
@@ -5469,12 +5165,6 @@
         </w:tc>
       </w:tr>
       <w:tr>
-        <w:tblPrEx>
-          <w:tblCellMar>
-            <w:top w:w="0" w:type="dxa"/>
-            <w:bottom w:w="0" w:type="dxa"/>
-          </w:tblCellMar>
-        </w:tblPrEx>
         <w:tc>
           <w:tcPr>
             <w:tcW w:w="2340" w:type="dxa"/>
@@ -5623,12 +5313,6 @@
         <w:gridCol w:w="9360"/>
       </w:tblGrid>
       <w:tr>
-        <w:tblPrEx>
-          <w:tblCellMar>
-            <w:top w:w="0" w:type="dxa"/>
-            <w:bottom w:w="0" w:type="dxa"/>
-          </w:tblCellMar>
-        </w:tblPrEx>
         <w:tc>
           <w:tcPr>
             <w:tcW w:w="0" w:type="auto"/>
@@ -5658,17 +5342,7 @@
                 <w:sz w:val="20"/>
                 <w:szCs w:val="20"/>
               </w:rPr>
-              <w:t>⚡</w:t>
-            </w:r>
-            <w:r>
-              <w:rPr>
-                <w:b/>
-                <w:bCs/>
-                <w:color w:val="854F0B"/>
-                <w:sz w:val="20"/>
-                <w:szCs w:val="20"/>
-              </w:rPr>
-              <w:t xml:space="preserve">  Developer Note</w:t>
+              <w:t>⚡  Developer Note</w:t>
             </w:r>
           </w:p>
           <w:p>
@@ -5712,12 +5386,6 @@
         <w:gridCol w:w="3900"/>
       </w:tblGrid>
       <w:tr>
-        <w:tblPrEx>
-          <w:tblCellMar>
-            <w:top w:w="0" w:type="dxa"/>
-            <w:bottom w:w="0" w:type="dxa"/>
-          </w:tblCellMar>
-        </w:tblPrEx>
         <w:tc>
           <w:tcPr>
             <w:tcW w:w="2340" w:type="dxa"/>
@@ -5819,12 +5487,6 @@
         </w:tc>
       </w:tr>
       <w:tr>
-        <w:tblPrEx>
-          <w:tblCellMar>
-            <w:top w:w="0" w:type="dxa"/>
-            <w:bottom w:w="0" w:type="dxa"/>
-          </w:tblCellMar>
-        </w:tblPrEx>
         <w:tc>
           <w:tcPr>
             <w:tcW w:w="2340" w:type="dxa"/>
@@ -5931,12 +5593,6 @@
         </w:tc>
       </w:tr>
       <w:tr>
-        <w:tblPrEx>
-          <w:tblCellMar>
-            <w:top w:w="0" w:type="dxa"/>
-            <w:bottom w:w="0" w:type="dxa"/>
-          </w:tblCellMar>
-        </w:tblPrEx>
         <w:tc>
           <w:tcPr>
             <w:tcW w:w="2340" w:type="dxa"/>
@@ -6043,12 +5699,6 @@
         </w:tc>
       </w:tr>
       <w:tr>
-        <w:tblPrEx>
-          <w:tblCellMar>
-            <w:top w:w="0" w:type="dxa"/>
-            <w:bottom w:w="0" w:type="dxa"/>
-          </w:tblCellMar>
-        </w:tblPrEx>
         <w:tc>
           <w:tcPr>
             <w:tcW w:w="2340" w:type="dxa"/>
@@ -6138,12 +5788,6 @@
         </w:tc>
       </w:tr>
       <w:tr>
-        <w:tblPrEx>
-          <w:tblCellMar>
-            <w:top w:w="0" w:type="dxa"/>
-            <w:bottom w:w="0" w:type="dxa"/>
-          </w:tblCellMar>
-        </w:tblPrEx>
         <w:tc>
           <w:tcPr>
             <w:tcW w:w="2340" w:type="dxa"/>
@@ -6234,12 +5878,6 @@
         </w:tc>
       </w:tr>
       <w:tr>
-        <w:tblPrEx>
-          <w:tblCellMar>
-            <w:top w:w="0" w:type="dxa"/>
-            <w:bottom w:w="0" w:type="dxa"/>
-          </w:tblCellMar>
-        </w:tblPrEx>
         <w:tc>
           <w:tcPr>
             <w:tcW w:w="2340" w:type="dxa"/>
@@ -6328,12 +5966,6 @@
         </w:tc>
       </w:tr>
       <w:tr>
-        <w:tblPrEx>
-          <w:tblCellMar>
-            <w:top w:w="0" w:type="dxa"/>
-            <w:bottom w:w="0" w:type="dxa"/>
-          </w:tblCellMar>
-        </w:tblPrEx>
         <w:tc>
           <w:tcPr>
             <w:tcW w:w="2340" w:type="dxa"/>
@@ -6432,12 +6064,6 @@
         </w:tc>
       </w:tr>
       <w:tr>
-        <w:tblPrEx>
-          <w:tblCellMar>
-            <w:top w:w="0" w:type="dxa"/>
-            <w:bottom w:w="0" w:type="dxa"/>
-          </w:tblCellMar>
-        </w:tblPrEx>
         <w:tc>
           <w:tcPr>
             <w:tcW w:w="2340" w:type="dxa"/>
@@ -6572,12 +6198,6 @@
         <w:gridCol w:w="4680"/>
       </w:tblGrid>
       <w:tr>
-        <w:tblPrEx>
-          <w:tblCellMar>
-            <w:top w:w="0" w:type="dxa"/>
-            <w:bottom w:w="0" w:type="dxa"/>
-          </w:tblCellMar>
-        </w:tblPrEx>
         <w:tc>
           <w:tcPr>
             <w:tcW w:w="2340" w:type="dxa"/>
@@ -6679,12 +6299,6 @@
         </w:tc>
       </w:tr>
       <w:tr>
-        <w:tblPrEx>
-          <w:tblCellMar>
-            <w:top w:w="0" w:type="dxa"/>
-            <w:bottom w:w="0" w:type="dxa"/>
-          </w:tblCellMar>
-        </w:tblPrEx>
         <w:tc>
           <w:tcPr>
             <w:tcW w:w="2340" w:type="dxa"/>
@@ -6827,12 +6441,6 @@
         </w:tc>
       </w:tr>
       <w:tr>
-        <w:tblPrEx>
-          <w:tblCellMar>
-            <w:top w:w="0" w:type="dxa"/>
-            <w:bottom w:w="0" w:type="dxa"/>
-          </w:tblCellMar>
-        </w:tblPrEx>
         <w:tc>
           <w:tcPr>
             <w:tcW w:w="2340" w:type="dxa"/>
@@ -6957,12 +6565,6 @@
         </w:tc>
       </w:tr>
       <w:tr>
-        <w:tblPrEx>
-          <w:tblCellMar>
-            <w:top w:w="0" w:type="dxa"/>
-            <w:bottom w:w="0" w:type="dxa"/>
-          </w:tblCellMar>
-        </w:tblPrEx>
         <w:tc>
           <w:tcPr>
             <w:tcW w:w="2340" w:type="dxa"/>
@@ -7115,12 +6717,6 @@
         </w:tc>
       </w:tr>
       <w:tr>
-        <w:tblPrEx>
-          <w:tblCellMar>
-            <w:top w:w="0" w:type="dxa"/>
-            <w:bottom w:w="0" w:type="dxa"/>
-          </w:tblCellMar>
-        </w:tblPrEx>
         <w:tc>
           <w:tcPr>
             <w:tcW w:w="2340" w:type="dxa"/>
@@ -7273,12 +6869,6 @@
         </w:tc>
       </w:tr>
       <w:tr>
-        <w:tblPrEx>
-          <w:tblCellMar>
-            <w:top w:w="0" w:type="dxa"/>
-            <w:bottom w:w="0" w:type="dxa"/>
-          </w:tblCellMar>
-        </w:tblPrEx>
         <w:tc>
           <w:tcPr>
             <w:tcW w:w="2340" w:type="dxa"/>
@@ -7431,12 +7021,6 @@
         </w:tc>
       </w:tr>
       <w:tr>
-        <w:tblPrEx>
-          <w:tblCellMar>
-            <w:top w:w="0" w:type="dxa"/>
-            <w:bottom w:w="0" w:type="dxa"/>
-          </w:tblCellMar>
-        </w:tblPrEx>
         <w:tc>
           <w:tcPr>
             <w:tcW w:w="2340" w:type="dxa"/>
@@ -7571,12 +7155,6 @@
         </w:tc>
       </w:tr>
       <w:tr>
-        <w:tblPrEx>
-          <w:tblCellMar>
-            <w:top w:w="0" w:type="dxa"/>
-            <w:bottom w:w="0" w:type="dxa"/>
-          </w:tblCellMar>
-        </w:tblPrEx>
         <w:tc>
           <w:tcPr>
             <w:tcW w:w="2340" w:type="dxa"/>
@@ -7814,12 +7392,6 @@
         <w:gridCol w:w="4680"/>
       </w:tblGrid>
       <w:tr>
-        <w:tblPrEx>
-          <w:tblCellMar>
-            <w:top w:w="0" w:type="dxa"/>
-            <w:bottom w:w="0" w:type="dxa"/>
-          </w:tblCellMar>
-        </w:tblPrEx>
         <w:tc>
           <w:tcPr>
             <w:tcW w:w="2340" w:type="dxa"/>
@@ -7922,12 +7494,6 @@
         </w:tc>
       </w:tr>
       <w:tr>
-        <w:tblPrEx>
-          <w:tblCellMar>
-            <w:top w:w="0" w:type="dxa"/>
-            <w:bottom w:w="0" w:type="dxa"/>
-          </w:tblCellMar>
-        </w:tblPrEx>
         <w:tc>
           <w:tcPr>
             <w:tcW w:w="2340" w:type="dxa"/>
@@ -8034,12 +7600,6 @@
         </w:tc>
       </w:tr>
       <w:tr>
-        <w:tblPrEx>
-          <w:tblCellMar>
-            <w:top w:w="0" w:type="dxa"/>
-            <w:bottom w:w="0" w:type="dxa"/>
-          </w:tblCellMar>
-        </w:tblPrEx>
         <w:tc>
           <w:tcPr>
             <w:tcW w:w="2340" w:type="dxa"/>
@@ -8128,12 +7688,6 @@
         </w:tc>
       </w:tr>
       <w:tr>
-        <w:tblPrEx>
-          <w:tblCellMar>
-            <w:top w:w="0" w:type="dxa"/>
-            <w:bottom w:w="0" w:type="dxa"/>
-          </w:tblCellMar>
-        </w:tblPrEx>
         <w:tc>
           <w:tcPr>
             <w:tcW w:w="2340" w:type="dxa"/>
@@ -8222,12 +7776,6 @@
         </w:tc>
       </w:tr>
       <w:tr>
-        <w:tblPrEx>
-          <w:tblCellMar>
-            <w:top w:w="0" w:type="dxa"/>
-            <w:bottom w:w="0" w:type="dxa"/>
-          </w:tblCellMar>
-        </w:tblPrEx>
         <w:tc>
           <w:tcPr>
             <w:tcW w:w="2340" w:type="dxa"/>
@@ -8318,12 +7866,6 @@
         </w:tc>
       </w:tr>
       <w:tr>
-        <w:tblPrEx>
-          <w:tblCellMar>
-            <w:top w:w="0" w:type="dxa"/>
-            <w:bottom w:w="0" w:type="dxa"/>
-          </w:tblCellMar>
-        </w:tblPrEx>
         <w:tc>
           <w:tcPr>
             <w:tcW w:w="2340" w:type="dxa"/>
@@ -8414,12 +7956,6 @@
         </w:tc>
       </w:tr>
       <w:tr>
-        <w:tblPrEx>
-          <w:tblCellMar>
-            <w:top w:w="0" w:type="dxa"/>
-            <w:bottom w:w="0" w:type="dxa"/>
-          </w:tblCellMar>
-        </w:tblPrEx>
         <w:tc>
           <w:tcPr>
             <w:tcW w:w="2340" w:type="dxa"/>
@@ -8508,12 +8044,6 @@
         </w:tc>
       </w:tr>
       <w:tr>
-        <w:tblPrEx>
-          <w:tblCellMar>
-            <w:top w:w="0" w:type="dxa"/>
-            <w:bottom w:w="0" w:type="dxa"/>
-          </w:tblCellMar>
-        </w:tblPrEx>
         <w:tc>
           <w:tcPr>
             <w:tcW w:w="2340" w:type="dxa"/>
@@ -8638,12 +8168,6 @@
         </w:tc>
       </w:tr>
       <w:tr>
-        <w:tblPrEx>
-          <w:tblCellMar>
-            <w:top w:w="0" w:type="dxa"/>
-            <w:bottom w:w="0" w:type="dxa"/>
-          </w:tblCellMar>
-        </w:tblPrEx>
         <w:tc>
           <w:tcPr>
             <w:tcW w:w="2340" w:type="dxa"/>
@@ -8797,12 +8321,6 @@
         <w:gridCol w:w="4680"/>
       </w:tblGrid>
       <w:tr>
-        <w:tblPrEx>
-          <w:tblCellMar>
-            <w:top w:w="0" w:type="dxa"/>
-            <w:bottom w:w="0" w:type="dxa"/>
-          </w:tblCellMar>
-        </w:tblPrEx>
         <w:tc>
           <w:tcPr>
             <w:tcW w:w="2340" w:type="dxa"/>
@@ -8904,12 +8422,6 @@
         </w:tc>
       </w:tr>
       <w:tr>
-        <w:tblPrEx>
-          <w:tblCellMar>
-            <w:top w:w="0" w:type="dxa"/>
-            <w:bottom w:w="0" w:type="dxa"/>
-          </w:tblCellMar>
-        </w:tblPrEx>
         <w:tc>
           <w:tcPr>
             <w:tcW w:w="2340" w:type="dxa"/>
@@ -9000,12 +8512,6 @@
         </w:tc>
       </w:tr>
       <w:tr>
-        <w:tblPrEx>
-          <w:tblCellMar>
-            <w:top w:w="0" w:type="dxa"/>
-            <w:bottom w:w="0" w:type="dxa"/>
-          </w:tblCellMar>
-        </w:tblPrEx>
         <w:tc>
           <w:tcPr>
             <w:tcW w:w="2340" w:type="dxa"/>
@@ -9094,12 +8600,6 @@
         </w:tc>
       </w:tr>
       <w:tr>
-        <w:tblPrEx>
-          <w:tblCellMar>
-            <w:top w:w="0" w:type="dxa"/>
-            <w:bottom w:w="0" w:type="dxa"/>
-          </w:tblCellMar>
-        </w:tblPrEx>
         <w:tc>
           <w:tcPr>
             <w:tcW w:w="2340" w:type="dxa"/>
@@ -9188,12 +8688,6 @@
         </w:tc>
       </w:tr>
       <w:tr>
-        <w:tblPrEx>
-          <w:tblCellMar>
-            <w:top w:w="0" w:type="dxa"/>
-            <w:bottom w:w="0" w:type="dxa"/>
-          </w:tblCellMar>
-        </w:tblPrEx>
         <w:tc>
           <w:tcPr>
             <w:tcW w:w="2340" w:type="dxa"/>
@@ -9284,12 +8778,6 @@
         </w:tc>
       </w:tr>
       <w:tr>
-        <w:tblPrEx>
-          <w:tblCellMar>
-            <w:top w:w="0" w:type="dxa"/>
-            <w:bottom w:w="0" w:type="dxa"/>
-          </w:tblCellMar>
-        </w:tblPrEx>
         <w:tc>
           <w:tcPr>
             <w:tcW w:w="2340" w:type="dxa"/>
@@ -9378,12 +8866,6 @@
         </w:tc>
       </w:tr>
       <w:tr>
-        <w:tblPrEx>
-          <w:tblCellMar>
-            <w:top w:w="0" w:type="dxa"/>
-            <w:bottom w:w="0" w:type="dxa"/>
-          </w:tblCellMar>
-        </w:tblPrEx>
         <w:tc>
           <w:tcPr>
             <w:tcW w:w="2340" w:type="dxa"/>
@@ -9472,12 +8954,6 @@
         </w:tc>
       </w:tr>
       <w:tr>
-        <w:tblPrEx>
-          <w:tblCellMar>
-            <w:top w:w="0" w:type="dxa"/>
-            <w:bottom w:w="0" w:type="dxa"/>
-          </w:tblCellMar>
-        </w:tblPrEx>
         <w:tc>
           <w:tcPr>
             <w:tcW w:w="2340" w:type="dxa"/>
@@ -9602,12 +9078,6 @@
         </w:tc>
       </w:tr>
       <w:tr>
-        <w:tblPrEx>
-          <w:tblCellMar>
-            <w:top w:w="0" w:type="dxa"/>
-            <w:bottom w:w="0" w:type="dxa"/>
-          </w:tblCellMar>
-        </w:tblPrEx>
         <w:tc>
           <w:tcPr>
             <w:tcW w:w="2340" w:type="dxa"/>
@@ -9740,12 +9210,6 @@
         <w:gridCol w:w="9360"/>
       </w:tblGrid>
       <w:tr>
-        <w:tblPrEx>
-          <w:tblCellMar>
-            <w:top w:w="0" w:type="dxa"/>
-            <w:bottom w:w="0" w:type="dxa"/>
-          </w:tblCellMar>
-        </w:tblPrEx>
         <w:tc>
           <w:tcPr>
             <w:tcW w:w="0" w:type="auto"/>
@@ -9775,17 +9239,7 @@
                 <w:sz w:val="20"/>
                 <w:szCs w:val="20"/>
               </w:rPr>
-              <w:t>🕐</w:t>
-            </w:r>
-            <w:r>
-              <w:rPr>
-                <w:b/>
-                <w:bCs/>
-                <w:color w:val="3C3489"/>
-                <w:sz w:val="20"/>
-                <w:szCs w:val="20"/>
-              </w:rPr>
-              <w:t xml:space="preserve">  Assumption</w:t>
+              <w:t>🕐  Assumption</w:t>
             </w:r>
           </w:p>
           <w:p>
@@ -9830,12 +9284,6 @@
         <w:gridCol w:w="2600"/>
       </w:tblGrid>
       <w:tr>
-        <w:tblPrEx>
-          <w:tblCellMar>
-            <w:top w:w="0" w:type="dxa"/>
-            <w:bottom w:w="0" w:type="dxa"/>
-          </w:tblCellMar>
-        </w:tblPrEx>
         <w:tc>
           <w:tcPr>
             <w:tcW w:w="1560" w:type="dxa"/>
@@ -9971,12 +9419,6 @@
         </w:tc>
       </w:tr>
       <w:tr>
-        <w:tblPrEx>
-          <w:tblCellMar>
-            <w:top w:w="0" w:type="dxa"/>
-            <w:bottom w:w="0" w:type="dxa"/>
-          </w:tblCellMar>
-        </w:tblPrEx>
         <w:tc>
           <w:tcPr>
             <w:tcW w:w="1560" w:type="dxa"/>
@@ -10139,12 +9581,6 @@
         </w:tc>
       </w:tr>
       <w:tr>
-        <w:tblPrEx>
-          <w:tblCellMar>
-            <w:top w:w="0" w:type="dxa"/>
-            <w:bottom w:w="0" w:type="dxa"/>
-          </w:tblCellMar>
-        </w:tblPrEx>
         <w:tc>
           <w:tcPr>
             <w:tcW w:w="1560" w:type="dxa"/>
@@ -10271,12 +9707,6 @@
         </w:tc>
       </w:tr>
       <w:tr>
-        <w:tblPrEx>
-          <w:tblCellMar>
-            <w:top w:w="0" w:type="dxa"/>
-            <w:bottom w:w="0" w:type="dxa"/>
-          </w:tblCellMar>
-        </w:tblPrEx>
         <w:tc>
           <w:tcPr>
             <w:tcW w:w="1560" w:type="dxa"/>
@@ -10403,12 +9833,6 @@
         </w:tc>
       </w:tr>
       <w:tr>
-        <w:tblPrEx>
-          <w:tblCellMar>
-            <w:top w:w="0" w:type="dxa"/>
-            <w:bottom w:w="0" w:type="dxa"/>
-          </w:tblCellMar>
-        </w:tblPrEx>
         <w:tc>
           <w:tcPr>
             <w:tcW w:w="1560" w:type="dxa"/>
@@ -10535,12 +9959,6 @@
         </w:tc>
       </w:tr>
       <w:tr>
-        <w:tblPrEx>
-          <w:tblCellMar>
-            <w:top w:w="0" w:type="dxa"/>
-            <w:bottom w:w="0" w:type="dxa"/>
-          </w:tblCellMar>
-        </w:tblPrEx>
         <w:tc>
           <w:tcPr>
             <w:tcW w:w="1560" w:type="dxa"/>
@@ -10667,12 +10085,6 @@
         </w:tc>
       </w:tr>
       <w:tr>
-        <w:tblPrEx>
-          <w:tblCellMar>
-            <w:top w:w="0" w:type="dxa"/>
-            <w:bottom w:w="0" w:type="dxa"/>
-          </w:tblCellMar>
-        </w:tblPrEx>
         <w:tc>
           <w:tcPr>
             <w:tcW w:w="1560" w:type="dxa"/>
@@ -10897,13 +10309,7 @@
         <w:rPr>
           <w:color w:val="1A1A1A"/>
         </w:rPr>
-        <w:t>Arabic and Engl</w:t>
-      </w:r>
-      <w:r>
-        <w:rPr>
-          <w:color w:val="1A1A1A"/>
-        </w:rPr>
-        <w:t>ish UI both render correctly (RTL/LTR)</w:t>
+        <w:t>Arabic and English UI both render correctly (RTL/LTR)</w:t>
       </w:r>
     </w:p>
     <w:p>
@@ -10994,12 +10400,6 @@
         <w:gridCol w:w="9360"/>
       </w:tblGrid>
       <w:tr>
-        <w:tblPrEx>
-          <w:tblCellMar>
-            <w:top w:w="0" w:type="dxa"/>
-            <w:bottom w:w="0" w:type="dxa"/>
-          </w:tblCellMar>
-        </w:tblPrEx>
         <w:tc>
           <w:tcPr>
             <w:tcW w:w="0" w:type="auto"/>
@@ -11029,17 +10429,7 @@
                 <w:sz w:val="20"/>
                 <w:szCs w:val="20"/>
               </w:rPr>
-              <w:t>🏆</w:t>
-            </w:r>
-            <w:r>
-              <w:rPr>
-                <w:b/>
-                <w:bCs/>
-                <w:color w:val="0F6E56"/>
-                <w:sz w:val="20"/>
-                <w:szCs w:val="20"/>
-              </w:rPr>
-              <w:t xml:space="preserve">  Demo Checklist (Pitch Day)</w:t>
+              <w:t>🏆  Demo Checklist (Pitch Day)</w:t>
             </w:r>
           </w:p>
           <w:p>
@@ -11100,12 +10490,6 @@
         <w:gridCol w:w="4680"/>
       </w:tblGrid>
       <w:tr>
-        <w:tblPrEx>
-          <w:tblCellMar>
-            <w:top w:w="0" w:type="dxa"/>
-            <w:bottom w:w="0" w:type="dxa"/>
-          </w:tblCellMar>
-        </w:tblPrEx>
         <w:tc>
           <w:tcPr>
             <w:tcW w:w="3120" w:type="dxa"/>
@@ -11207,12 +10591,6 @@
         </w:tc>
       </w:tr>
       <w:tr>
-        <w:tblPrEx>
-          <w:tblCellMar>
-            <w:top w:w="0" w:type="dxa"/>
-            <w:bottom w:w="0" w:type="dxa"/>
-          </w:tblCellMar>
-        </w:tblPrEx>
         <w:tc>
           <w:tcPr>
             <w:tcW w:w="3120" w:type="dxa"/>
@@ -11322,12 +10700,6 @@
         </w:tc>
       </w:tr>
       <w:tr>
-        <w:tblPrEx>
-          <w:tblCellMar>
-            <w:top w:w="0" w:type="dxa"/>
-            <w:bottom w:w="0" w:type="dxa"/>
-          </w:tblCellMar>
-        </w:tblPrEx>
         <w:tc>
           <w:tcPr>
             <w:tcW w:w="3120" w:type="dxa"/>
@@ -11455,12 +10827,6 @@
         </w:tc>
       </w:tr>
       <w:tr>
-        <w:tblPrEx>
-          <w:tblCellMar>
-            <w:top w:w="0" w:type="dxa"/>
-            <w:bottom w:w="0" w:type="dxa"/>
-          </w:tblCellMar>
-        </w:tblPrEx>
         <w:tc>
           <w:tcPr>
             <w:tcW w:w="3120" w:type="dxa"/>
@@ -11570,12 +10936,6 @@
         </w:tc>
       </w:tr>
       <w:tr>
-        <w:tblPrEx>
-          <w:tblCellMar>
-            <w:top w:w="0" w:type="dxa"/>
-            <w:bottom w:w="0" w:type="dxa"/>
-          </w:tblCellMar>
-        </w:tblPrEx>
         <w:tc>
           <w:tcPr>
             <w:tcW w:w="3120" w:type="dxa"/>

</xml_diff>